<commit_message>
deleted .idea folder (not needed), added git repo in docx.
</commit_message>
<xml_diff>
--- a/Proj/Project Report.docx
+++ b/Proj/Project Report.docx
@@ -58,6 +58,35 @@
         </w:rPr>
         <w:t>Yoav Shaked, 315152629</w:t>
       </w:r>
+    </w:p>
+    <w:p>
+      <w:pPr>
+        <w:bidi w:val="0"/>
+      </w:pPr>
+      <w:r>
+        <w:t>Please pay attention, a copy of the code is present for cloning here:</w:t>
+      </w:r>
+    </w:p>
+    <w:p>
+      <w:pPr>
+        <w:bidi w:val="0"/>
+      </w:pPr>
+      <w:hyperlink r:id="rId7" w:history="1">
+        <w:proofErr w:type="spellStart"/>
+        <w:r>
+          <w:rPr>
+            <w:rStyle w:val="Hyperlink"/>
+          </w:rPr>
+          <w:t>yardencarmel</w:t>
+        </w:r>
+        <w:proofErr w:type="spellEnd"/>
+        <w:r>
+          <w:rPr>
+            <w:rStyle w:val="Hyperlink"/>
+          </w:rPr>
+          <w:t>/Computer-Vision: CV course @ TAU</w:t>
+        </w:r>
+      </w:hyperlink>
     </w:p>
     <w:p>
       <w:pPr>
@@ -485,7 +514,7 @@
                     <pic:cNvPicPr/>
                   </pic:nvPicPr>
                   <pic:blipFill rotWithShape="1">
-                    <a:blip r:embed="rId7"/>
+                    <a:blip r:embed="rId8"/>
                     <a:srcRect l="6824" t="6824" r="6824" b="6824"/>
                     <a:stretch>
                       <a:fillRect/>
@@ -739,7 +768,7 @@
                     <pic:cNvPicPr/>
                   </pic:nvPicPr>
                   <pic:blipFill rotWithShape="1">
-                    <a:blip r:embed="rId8"/>
+                    <a:blip r:embed="rId9"/>
                     <a:srcRect l="5539" t="5539" r="5539" b="5539"/>
                     <a:stretch>
                       <a:fillRect/>
@@ -939,7 +968,7 @@
                     <pic:cNvPicPr/>
                   </pic:nvPicPr>
                   <pic:blipFill rotWithShape="1">
-                    <a:blip r:embed="rId9"/>
+                    <a:blip r:embed="rId10"/>
                     <a:srcRect l="5522" t="5522" r="5522" b="5522"/>
                     <a:stretch>
                       <a:fillRect/>
@@ -1164,7 +1193,7 @@
                     <pic:cNvPicPr/>
                   </pic:nvPicPr>
                   <pic:blipFill rotWithShape="1">
-                    <a:blip r:embed="rId10"/>
+                    <a:blip r:embed="rId11"/>
                     <a:srcRect l="4639" t="4639" r="4639" b="4639"/>
                     <a:stretch>
                       <a:fillRect/>
@@ -1295,7 +1324,7 @@
                     <pic:cNvPicPr/>
                   </pic:nvPicPr>
                   <pic:blipFill rotWithShape="1">
-                    <a:blip r:embed="rId11"/>
+                    <a:blip r:embed="rId12"/>
                     <a:srcRect l="3917" t="3917" r="3917" b="3917"/>
                     <a:stretch>
                       <a:fillRect/>
@@ -1808,7 +1837,7 @@
                     <pic:cNvPicPr/>
                   </pic:nvPicPr>
                   <pic:blipFill rotWithShape="1">
-                    <a:blip r:embed="rId12"/>
+                    <a:blip r:embed="rId13"/>
                     <a:srcRect l="5021" t="5021" r="5021" b="5021"/>
                     <a:stretch>
                       <a:fillRect/>
@@ -1948,7 +1977,7 @@
                     <pic:cNvPicPr/>
                   </pic:nvPicPr>
                   <pic:blipFill rotWithShape="1">
-                    <a:blip r:embed="rId13"/>
+                    <a:blip r:embed="rId14"/>
                     <a:srcRect l="2651" t="2651" r="2651" b="2651"/>
                     <a:stretch>
                       <a:fillRect/>
@@ -3283,7 +3312,7 @@
                     <pic:cNvPicPr/>
                   </pic:nvPicPr>
                   <pic:blipFill rotWithShape="1">
-                    <a:blip r:embed="rId14"/>
+                    <a:blip r:embed="rId15"/>
                     <a:srcRect l="5687" t="5687" r="5687" b="5687"/>
                     <a:stretch>
                       <a:fillRect/>
@@ -3424,7 +3453,7 @@
                     <pic:cNvPicPr/>
                   </pic:nvPicPr>
                   <pic:blipFill rotWithShape="1">
-                    <a:blip r:embed="rId15"/>
+                    <a:blip r:embed="rId16"/>
                     <a:srcRect l="3223" t="3223" r="3223" b="3223"/>
                     <a:stretch>
                       <a:fillRect/>
@@ -3622,7 +3651,7 @@
                     <pic:cNvPicPr/>
                   </pic:nvPicPr>
                   <pic:blipFill rotWithShape="1">
-                    <a:blip r:embed="rId16"/>
+                    <a:blip r:embed="rId17"/>
                     <a:srcRect l="5118" t="5118" r="5118" b="5118"/>
                     <a:stretch>
                       <a:fillRect/>
@@ -3751,7 +3780,7 @@
                     <pic:cNvPicPr/>
                   </pic:nvPicPr>
                   <pic:blipFill rotWithShape="1">
-                    <a:blip r:embed="rId17"/>
+                    <a:blip r:embed="rId18"/>
                     <a:srcRect l="4170" t="4170" r="4170" b="4170"/>
                     <a:stretch>
                       <a:fillRect/>
@@ -4053,7 +4082,7 @@
                     <pic:cNvPicPr/>
                   </pic:nvPicPr>
                   <pic:blipFill rotWithShape="1">
-                    <a:blip r:embed="rId18"/>
+                    <a:blip r:embed="rId19"/>
                     <a:srcRect l="11942" t="-4" r="9196" b="12411"/>
                     <a:stretch>
                       <a:fillRect/>
@@ -4116,7 +4145,7 @@
                     </pic:cNvPicPr>
                   </pic:nvPicPr>
                   <pic:blipFill rotWithShape="1">
-                    <a:blip r:embed="rId19">
+                    <a:blip r:embed="rId20">
                       <a:extLst>
                         <a:ext uri="{28A0092B-C50C-407E-A947-70E740481C1C}">
                           <a14:useLocalDpi xmlns:a14="http://schemas.microsoft.com/office/drawing/2010/main" val="0"/>
@@ -4250,7 +4279,7 @@
                     <pic:cNvPicPr/>
                   </pic:nvPicPr>
                   <pic:blipFill rotWithShape="1">
-                    <a:blip r:embed="rId20"/>
+                    <a:blip r:embed="rId21"/>
                     <a:srcRect l="11375" r="9010" b="12798"/>
                     <a:stretch>
                       <a:fillRect/>
@@ -4311,7 +4340,7 @@
                     </pic:cNvPicPr>
                   </pic:nvPicPr>
                   <pic:blipFill rotWithShape="1">
-                    <a:blip r:embed="rId21">
+                    <a:blip r:embed="rId22">
                       <a:extLst>
                         <a:ext uri="{28A0092B-C50C-407E-A947-70E740481C1C}">
                           <a14:useLocalDpi xmlns:a14="http://schemas.microsoft.com/office/drawing/2010/main" val="0"/>
@@ -4416,13 +4445,7 @@
         <w:rPr>
           <w:rFonts w:asciiTheme="minorBidi" w:hAnsiTheme="minorBidi"/>
         </w:rPr>
-        <w:t>which are often the weakest points in Deepfake generation</w:t>
-      </w:r>
-      <w:r>
-        <w:rPr>
-          <w:rFonts w:asciiTheme="minorBidi" w:hAnsiTheme="minorBidi"/>
-        </w:rPr>
-        <w:t>.</w:t>
+        <w:t>which are often the weakest points in Deepfake generation.</w:t>
       </w:r>
       <w:r>
         <w:rPr>
@@ -4460,19 +4483,7 @@
         <w:rPr>
           <w:rFonts w:asciiTheme="minorBidi" w:hAnsiTheme="minorBidi"/>
         </w:rPr>
-        <w:t xml:space="preserve">on Synthetic experiment (Bottom part), the saliency map appears more granular and less specific, avoiding distinct facial landmarks. This suggests that the model </w:t>
-      </w:r>
-      <w:r>
-        <w:rPr>
-          <w:rFonts w:asciiTheme="minorBidi" w:hAnsiTheme="minorBidi"/>
-        </w:rPr>
-        <w:t>does not rely</w:t>
-      </w:r>
-      <w:r>
-        <w:rPr>
-          <w:rFonts w:asciiTheme="minorBidi" w:hAnsiTheme="minorBidi"/>
-        </w:rPr>
-        <w:t xml:space="preserve"> on isolated features (like eyes or mouth) but is instead scrutinizing the global facial texture and structural consistency. The</w:t>
+        <w:t>on Synthetic experiment (Bottom part), the saliency map appears more granular and less specific, avoiding distinct facial landmarks. This suggests that the model does not rely on isolated features (like eyes or mouth) but is instead scrutinizing the global facial texture and structural consistency. The</w:t>
       </w:r>
       <w:r>
         <w:rPr>
@@ -4662,7 +4673,7 @@
                     <pic:cNvPicPr/>
                   </pic:nvPicPr>
                   <pic:blipFill rotWithShape="1">
-                    <a:blip r:embed="rId22"/>
+                    <a:blip r:embed="rId23"/>
                     <a:srcRect l="15163" t="6445" r="16424" b="4638"/>
                     <a:stretch>
                       <a:fillRect/>
@@ -4723,7 +4734,7 @@
                     <pic:cNvPicPr/>
                   </pic:nvPicPr>
                   <pic:blipFill rotWithShape="1">
-                    <a:blip r:embed="rId23"/>
+                    <a:blip r:embed="rId24"/>
                     <a:srcRect l="15641" t="6824" r="18387" b="4076"/>
                     <a:stretch>
                       <a:fillRect/>
@@ -4817,13 +4828,7 @@
         <w:rPr>
           <w:rFonts w:asciiTheme="minorBidi" w:hAnsiTheme="minorBidi"/>
         </w:rPr>
-        <w:t xml:space="preserve"> model appears to be exploiting the statistical anomalies at this "seam" between the generated face and the original background to distinguish fakes from real images.</w:t>
-      </w:r>
-      <w:r>
-        <w:rPr>
-          <w:rFonts w:asciiTheme="minorBidi" w:hAnsiTheme="minorBidi"/>
-        </w:rPr>
-        <w:t xml:space="preserve"> </w:t>
+        <w:t xml:space="preserve"> model appears to be exploiting the statistical anomalies at this "seam" between the generated face and the original background to distinguish fakes from real images. </w:t>
       </w:r>
       <w:r>
         <w:rPr>
@@ -4905,7 +4910,7 @@
                     <pic:cNvPicPr/>
                   </pic:nvPicPr>
                   <pic:blipFill rotWithShape="1">
-                    <a:blip r:embed="rId24"/>
+                    <a:blip r:embed="rId25"/>
                     <a:srcRect l="15927" t="6256" r="18670" b="5016"/>
                     <a:stretch>
                       <a:fillRect/>
@@ -4966,7 +4971,7 @@
                     <pic:cNvPicPr/>
                   </pic:nvPicPr>
                   <pic:blipFill rotWithShape="1">
-                    <a:blip r:embed="rId25"/>
+                    <a:blip r:embed="rId26"/>
                     <a:srcRect l="15500" t="5117" r="18244" b="4068"/>
                     <a:stretch>
                       <a:fillRect/>
@@ -5161,7 +5166,7 @@
                     <pic:cNvPicPr/>
                   </pic:nvPicPr>
                   <pic:blipFill rotWithShape="1">
-                    <a:blip r:embed="rId26"/>
+                    <a:blip r:embed="rId27"/>
                     <a:srcRect l="15784" t="6824" r="18528" b="3882"/>
                     <a:stretch>
                       <a:fillRect/>
@@ -5222,7 +5227,7 @@
                     <pic:cNvPicPr/>
                   </pic:nvPicPr>
                   <pic:blipFill rotWithShape="1">
-                    <a:blip r:embed="rId27"/>
+                    <a:blip r:embed="rId28"/>
                     <a:srcRect l="15784" t="6256" r="17808" b="1420"/>
                     <a:stretch>
                       <a:fillRect/>
@@ -5346,13 +5351,7 @@
         <w:rPr>
           <w:rFonts w:asciiTheme="minorBidi" w:hAnsiTheme="minorBidi"/>
         </w:rPr>
-        <w:t>where GANs are known to struggle with geometric consistency and texture generation. This confirms that the pre-trained backbone successfully guided the model to focus on the high-level semantic features necessary to distinguish synthetic images, turning the "random guessing" of the baseline into effective classification.</w:t>
-      </w:r>
-      <w:r>
-        <w:rPr>
-          <w:rFonts w:asciiTheme="minorBidi" w:hAnsiTheme="minorBidi"/>
-        </w:rPr>
-        <w:t xml:space="preserve"> </w:t>
+        <w:t xml:space="preserve">where GANs are known to struggle with geometric consistency and texture generation. This confirms that the pre-trained backbone successfully guided the model to focus on the high-level semantic features necessary to distinguish synthetic images, turning the "random guessing" of the baseline into effective classification. </w:t>
       </w:r>
       <w:r>
         <w:rPr>
@@ -5385,7 +5384,7 @@
         <w:spacing w:line="360" w:lineRule="auto"/>
         <w:jc w:val="both"/>
         <w:rPr>
-          <w:rFonts w:asciiTheme="minorBidi" w:hAnsiTheme="minorBidi" w:hint="cs"/>
+          <w:rFonts w:asciiTheme="minorBidi" w:hAnsiTheme="minorBidi"/>
           <w:rtl/>
           <w:lang w:val="en-IL"/>
         </w:rPr>
@@ -7300,6 +7299,29 @@
     <w:uiPriority w:val="99"/>
     <w:rsid w:val="002C2D30"/>
   </w:style>
+  <w:style w:type="character" w:styleId="Hyperlink">
+    <w:name w:val="Hyperlink"/>
+    <w:basedOn w:val="DefaultParagraphFont"/>
+    <w:uiPriority w:val="99"/>
+    <w:unhideWhenUsed/>
+    <w:rsid w:val="00361F5B"/>
+    <w:rPr>
+      <w:color w:val="467886" w:themeColor="hyperlink"/>
+      <w:u w:val="single"/>
+    </w:rPr>
+  </w:style>
+  <w:style w:type="character" w:styleId="UnresolvedMention">
+    <w:name w:val="Unresolved Mention"/>
+    <w:basedOn w:val="DefaultParagraphFont"/>
+    <w:uiPriority w:val="99"/>
+    <w:semiHidden/>
+    <w:unhideWhenUsed/>
+    <w:rsid w:val="00361F5B"/>
+    <w:rPr>
+      <w:color w:val="605E5C"/>
+      <w:shd w:val="clear" w:color="auto" w:fill="E1DFDD"/>
+    </w:rPr>
+  </w:style>
 </w:styles>
 </file>
 

</xml_diff>